<commit_message>
docs: add verified GitHub Actions and Kubernetes deployment screenshots to report
</commit_message>
<xml_diff>
--- a/report/REPORT.docx
+++ b/report/REPORT.docx
@@ -3441,7 +3441,7 @@
       </w:r>
     </w:p>
     <w:bookmarkEnd w:id="49"/>
-    <w:bookmarkStart w:id="50" w:name="cicd-pipeline-github-actions"/>
+    <w:bookmarkStart w:id="53" w:name="cicd-pipeline-github-actions"/>
     <w:p>
       <w:pPr>
         <w:pStyle w:val="Heading1"/>
@@ -3812,224 +3812,6 @@
         <w:t xml:space="preserve">before any test ran.</w:t>
       </w:r>
     </w:p>
-    <w:tbl>
-      <w:tblPr>
-        <w:tblStyle w:val="FigureTable"/>
-        <w:tblW w:type="auto" w:w="0"/>
-        <w:jc w:val="center"/>
-        <w:tblLook w:firstRow="0" w:lastRow="0" w:firstColumn="0" w:lastColumn="0"/>
-      </w:tblPr>
-      <w:tblGrid>
-        <w:gridCol w:w="7920"/>
-      </w:tblGrid>
-      <w:tr>
-        <w:tc>
-          <w:tcPr/>
-          <w:p>
-            <w:pPr>
-              <w:pStyle w:val="Compact"/>
-              <w:jc w:val="center"/>
-            </w:pPr>
-            <w:r>
-              <w:t xml:space="preserve">GitHub Actions run</w:t>
-            </w:r>
-          </w:p>
-        </w:tc>
-      </w:tr>
-    </w:tbl>
-    <w:p>
-      <w:pPr>
-        <w:pStyle w:val="ImageCaption"/>
-      </w:pPr>
-      <w:r>
-        <w:t xml:space="preserve">GitHub Actions run</w:t>
-      </w:r>
-    </w:p>
-    <w:bookmarkEnd w:id="50"/>
-    <w:bookmarkStart w:id="54" w:name="containerisation-and-deployment"/>
-    <w:p>
-      <w:pPr>
-        <w:pStyle w:val="Heading1"/>
-      </w:pPr>
-      <w:r>
-        <w:t xml:space="preserve">10. Containerisation and deployment</w:t>
-      </w:r>
-    </w:p>
-    <w:p>
-      <w:pPr>
-        <w:pStyle w:val="FirstParagraph"/>
-      </w:pPr>
-      <w:r>
-        <w:rPr>
-          <w:b/>
-          <w:bCs/>
-        </w:rPr>
-        <w:t xml:space="preserve">Docker image.</w:t>
-      </w:r>
-      <w:r>
-        <w:t xml:space="preserve"> </w:t>
-      </w:r>
-      <w:r>
-        <w:t xml:space="preserve">Based on</w:t>
-      </w:r>
-      <w:r>
-        <w:t xml:space="preserve"> </w:t>
-      </w:r>
-      <w:r>
-        <w:rPr>
-          <w:rStyle w:val="VerbatimChar"/>
-        </w:rPr>
-        <w:t xml:space="preserve">python:3.11-slim</w:t>
-      </w:r>
-      <w:r>
-        <w:t xml:space="preserve">, it installs only the serving dependencies plus the</w:t>
-      </w:r>
-      <w:r>
-        <w:t xml:space="preserve"> </w:t>
-      </w:r>
-      <w:r>
-        <w:rPr>
-          <w:rStyle w:val="VerbatimChar"/>
-        </w:rPr>
-        <w:t xml:space="preserve">heartrisk</w:t>
-      </w:r>
-      <w:r>
-        <w:t xml:space="preserve"> </w:t>
-      </w:r>
-      <w:r>
-        <w:t xml:space="preserve">package and copies in the model. It runs as a non-root user (uid 10001), has a</w:t>
-      </w:r>
-      <w:r>
-        <w:t xml:space="preserve"> </w:t>
-      </w:r>
-      <w:r>
-        <w:rPr>
-          <w:rStyle w:val="VerbatimChar"/>
-        </w:rPr>
-        <w:t xml:space="preserve">HEALTHCHECK</w:t>
-      </w:r>
-      <w:r>
-        <w:t xml:space="preserve">,</w:t>
-      </w:r>
-      <w:r>
-        <w:t xml:space="preserve"> </w:t>
-      </w:r>
-      <w:r>
-        <w:t xml:space="preserve">and uses an allow-list</w:t>
-      </w:r>
-      <w:r>
-        <w:t xml:space="preserve"> </w:t>
-      </w:r>
-      <w:r>
-        <w:rPr>
-          <w:rStyle w:val="VerbatimChar"/>
-        </w:rPr>
-        <w:t xml:space="preserve">.dockerignore</w:t>
-      </w:r>
-      <w:r>
-        <w:t xml:space="preserve"> </w:t>
-      </w:r>
-      <w:r>
-        <w:t xml:space="preserve">so data, venvs and mlruns never enter the build context.</w:t>
-      </w:r>
-    </w:p>
-    <w:p>
-      <w:pPr>
-        <w:pStyle w:val="SourceCode"/>
-      </w:pPr>
-      <w:r>
-        <w:rPr>
-          <w:rStyle w:val="VerbatimChar"/>
-        </w:rPr>
-        <w:t xml:space="preserve">$ curl -X POST localhost:8000/predict -H 'Content-Type: application/json' -d @samples/patient_high_risk.json</w:t>
-      </w:r>
-      <w:r>
-        <w:br/>
-      </w:r>
-      <w:r>
-        <w:rPr>
-          <w:rStyle w:val="VerbatimChar"/>
-        </w:rPr>
-        <w:t xml:space="preserve">{"prediction":1,"label":"heart_disease","confidence":0.9969,"probability_disease":0.9969,</w:t>
-      </w:r>
-      <w:r>
-        <w:br/>
-      </w:r>
-      <w:r>
-        <w:rPr>
-          <w:rStyle w:val="VerbatimChar"/>
-        </w:rPr>
-        <w:t xml:space="preserve"> "model_name":"logistic_regression","model_version":"1.0.0"}</w:t>
-      </w:r>
-      <w:r>
-        <w:br/>
-      </w:r>
-      <w:r>
-        <w:rPr>
-          <w:rStyle w:val="VerbatimChar"/>
-        </w:rPr>
-        <w:t xml:space="preserve">$ curl -X POST localhost:8000/predict -H 'Content-Type: application/json' -d @samples/patient_low_risk.json</w:t>
-      </w:r>
-      <w:r>
-        <w:br/>
-      </w:r>
-      <w:r>
-        <w:rPr>
-          <w:rStyle w:val="VerbatimChar"/>
-        </w:rPr>
-        <w:t xml:space="preserve">{"prediction":0,"label":"no_heart_disease","confidence":0.7577,"probability_disease":0.2423, ...}</w:t>
-      </w:r>
-    </w:p>
-    <w:p>
-      <w:pPr>
-        <w:pStyle w:val="FirstParagraph"/>
-      </w:pPr>
-      <w:r>
-        <w:t xml:space="preserve">The request is validated with Pydantic, using clinical ranges and allowed codes; invalid input gets an HTTP</w:t>
-      </w:r>
-      <w:r>
-        <w:t xml:space="preserve"> </w:t>
-      </w:r>
-      <w:r>
-        <w:t xml:space="preserve">422 with a field-level message.</w:t>
-      </w:r>
-      <w:r>
-        <w:t xml:space="preserve"> </w:t>
-      </w:r>
-      <w:r>
-        <w:rPr>
-          <w:rStyle w:val="VerbatimChar"/>
-        </w:rPr>
-        <w:t xml:space="preserve">ca</w:t>
-      </w:r>
-      <w:r>
-        <w:t xml:space="preserve"> </w:t>
-      </w:r>
-      <w:r>
-        <w:t xml:space="preserve">and</w:t>
-      </w:r>
-      <w:r>
-        <w:t xml:space="preserve"> </w:t>
-      </w:r>
-      <w:r>
-        <w:rPr>
-          <w:rStyle w:val="VerbatimChar"/>
-        </w:rPr>
-        <w:t xml:space="preserve">thal</w:t>
-      </w:r>
-      <w:r>
-        <w:t xml:space="preserve"> </w:t>
-      </w:r>
-      <w:r>
-        <w:t xml:space="preserve">are optional because they are the fields most often missing</w:t>
-      </w:r>
-      <w:r>
-        <w:t xml:space="preserve"> </w:t>
-      </w:r>
-      <w:r>
-        <w:t xml:space="preserve">in practice, and the pipeline imputes them.</w:t>
-      </w:r>
-    </w:p>
     <w:p>
       <w:pPr>
         <w:pStyle w:val="CaptionedFigure"/>
@@ -4037,20 +3819,260 @@
       <w:r>
         <w:drawing>
           <wp:inline>
-            <wp:extent cx="5334000" cy="3333750"/>
+            <wp:extent cx="5334000" cy="5750718"/>
             <wp:effectExtent b="0" l="0" r="0" t="0"/>
-            <wp:docPr descr="Swagger UI" title="" id="52" name="Picture"/>
+            <wp:docPr descr="GitHub Actions run" title="" id="51" name="Picture"/>
             <a:graphic>
               <a:graphicData uri="http://schemas.openxmlformats.org/drawingml/2006/picture">
                 <pic:pic>
                   <pic:nvPicPr>
-                    <pic:cNvPr descr="screenshots/05_swagger_docs.png" id="53" name="Picture"/>
+                    <pic:cNvPr descr="screenshots/01_github_actions_pipeline.png" id="52" name="Picture"/>
                     <pic:cNvPicPr>
                       <a:picLocks noChangeArrowheads="1" noChangeAspect="1"/>
                     </pic:cNvPicPr>
                   </pic:nvPicPr>
                   <pic:blipFill>
-                    <a:blip r:embed="rId51"/>
+                    <a:blip r:embed="rId50"/>
+                    <a:stretch>
+                      <a:fillRect/>
+                    </a:stretch>
+                  </pic:blipFill>
+                  <pic:spPr bwMode="auto">
+                    <a:xfrm>
+                      <a:off x="0" y="0"/>
+                      <a:ext cx="5334000" cy="5750718"/>
+                    </a:xfrm>
+                    <a:prstGeom prst="rect">
+                      <a:avLst/>
+                    </a:prstGeom>
+                    <a:noFill/>
+                    <a:ln w="9525">
+                      <a:noFill/>
+                      <a:headEnd/>
+                      <a:tailEnd/>
+                    </a:ln>
+                  </pic:spPr>
+                </pic:pic>
+              </a:graphicData>
+            </a:graphic>
+          </wp:inline>
+        </w:drawing>
+      </w:r>
+    </w:p>
+    <w:p>
+      <w:pPr>
+        <w:pStyle w:val="ImageCaption"/>
+      </w:pPr>
+      <w:r>
+        <w:t xml:space="preserve">GitHub Actions run</w:t>
+      </w:r>
+    </w:p>
+    <w:bookmarkEnd w:id="53"/>
+    <w:bookmarkStart w:id="63" w:name="containerisation-and-deployment"/>
+    <w:p>
+      <w:pPr>
+        <w:pStyle w:val="Heading1"/>
+      </w:pPr>
+      <w:r>
+        <w:t xml:space="preserve">10. Containerisation and deployment</w:t>
+      </w:r>
+    </w:p>
+    <w:p>
+      <w:pPr>
+        <w:pStyle w:val="FirstParagraph"/>
+      </w:pPr>
+      <w:r>
+        <w:rPr>
+          <w:b/>
+          <w:bCs/>
+        </w:rPr>
+        <w:t xml:space="preserve">Docker image.</w:t>
+      </w:r>
+      <w:r>
+        <w:t xml:space="preserve"> </w:t>
+      </w:r>
+      <w:r>
+        <w:t xml:space="preserve">Based on</w:t>
+      </w:r>
+      <w:r>
+        <w:t xml:space="preserve"> </w:t>
+      </w:r>
+      <w:r>
+        <w:rPr>
+          <w:rStyle w:val="VerbatimChar"/>
+        </w:rPr>
+        <w:t xml:space="preserve">python:3.11-slim</w:t>
+      </w:r>
+      <w:r>
+        <w:t xml:space="preserve">, it installs only the serving dependencies plus the</w:t>
+      </w:r>
+      <w:r>
+        <w:t xml:space="preserve"> </w:t>
+      </w:r>
+      <w:r>
+        <w:rPr>
+          <w:rStyle w:val="VerbatimChar"/>
+        </w:rPr>
+        <w:t xml:space="preserve">heartrisk</w:t>
+      </w:r>
+      <w:r>
+        <w:t xml:space="preserve"> </w:t>
+      </w:r>
+      <w:r>
+        <w:t xml:space="preserve">package and copies in the model. It runs as a non-root user (uid 10001), has a</w:t>
+      </w:r>
+      <w:r>
+        <w:t xml:space="preserve"> </w:t>
+      </w:r>
+      <w:r>
+        <w:rPr>
+          <w:rStyle w:val="VerbatimChar"/>
+        </w:rPr>
+        <w:t xml:space="preserve">HEALTHCHECK</w:t>
+      </w:r>
+      <w:r>
+        <w:t xml:space="preserve">,</w:t>
+      </w:r>
+      <w:r>
+        <w:t xml:space="preserve"> </w:t>
+      </w:r>
+      <w:r>
+        <w:t xml:space="preserve">and uses an allow-list</w:t>
+      </w:r>
+      <w:r>
+        <w:t xml:space="preserve"> </w:t>
+      </w:r>
+      <w:r>
+        <w:rPr>
+          <w:rStyle w:val="VerbatimChar"/>
+        </w:rPr>
+        <w:t xml:space="preserve">.dockerignore</w:t>
+      </w:r>
+      <w:r>
+        <w:t xml:space="preserve"> </w:t>
+      </w:r>
+      <w:r>
+        <w:t xml:space="preserve">so data, venvs and mlruns never enter the build context.</w:t>
+      </w:r>
+    </w:p>
+    <w:p>
+      <w:pPr>
+        <w:pStyle w:val="SourceCode"/>
+      </w:pPr>
+      <w:r>
+        <w:rPr>
+          <w:rStyle w:val="VerbatimChar"/>
+        </w:rPr>
+        <w:t xml:space="preserve">$ curl -X POST localhost:8000/predict -H 'Content-Type: application/json' -d @samples/patient_high_risk.json</w:t>
+      </w:r>
+      <w:r>
+        <w:br/>
+      </w:r>
+      <w:r>
+        <w:rPr>
+          <w:rStyle w:val="VerbatimChar"/>
+        </w:rPr>
+        <w:t xml:space="preserve">{"prediction":1,"label":"heart_disease","confidence":0.9969,"probability_disease":0.9969,</w:t>
+      </w:r>
+      <w:r>
+        <w:br/>
+      </w:r>
+      <w:r>
+        <w:rPr>
+          <w:rStyle w:val="VerbatimChar"/>
+        </w:rPr>
+        <w:t xml:space="preserve"> "model_name":"logistic_regression","model_version":"1.0.0"}</w:t>
+      </w:r>
+      <w:r>
+        <w:br/>
+      </w:r>
+      <w:r>
+        <w:rPr>
+          <w:rStyle w:val="VerbatimChar"/>
+        </w:rPr>
+        <w:t xml:space="preserve">$ curl -X POST localhost:8000/predict -H 'Content-Type: application/json' -d @samples/patient_low_risk.json</w:t>
+      </w:r>
+      <w:r>
+        <w:br/>
+      </w:r>
+      <w:r>
+        <w:rPr>
+          <w:rStyle w:val="VerbatimChar"/>
+        </w:rPr>
+        <w:t xml:space="preserve">{"prediction":0,"label":"no_heart_disease","confidence":0.7577,"probability_disease":0.2423, ...}</w:t>
+      </w:r>
+    </w:p>
+    <w:p>
+      <w:pPr>
+        <w:pStyle w:val="FirstParagraph"/>
+      </w:pPr>
+      <w:r>
+        <w:t xml:space="preserve">The request is validated with Pydantic, using clinical ranges and allowed codes; invalid input gets an HTTP</w:t>
+      </w:r>
+      <w:r>
+        <w:t xml:space="preserve"> </w:t>
+      </w:r>
+      <w:r>
+        <w:t xml:space="preserve">422 with a field-level message.</w:t>
+      </w:r>
+      <w:r>
+        <w:t xml:space="preserve"> </w:t>
+      </w:r>
+      <w:r>
+        <w:rPr>
+          <w:rStyle w:val="VerbatimChar"/>
+        </w:rPr>
+        <w:t xml:space="preserve">ca</w:t>
+      </w:r>
+      <w:r>
+        <w:t xml:space="preserve"> </w:t>
+      </w:r>
+      <w:r>
+        <w:t xml:space="preserve">and</w:t>
+      </w:r>
+      <w:r>
+        <w:t xml:space="preserve"> </w:t>
+      </w:r>
+      <w:r>
+        <w:rPr>
+          <w:rStyle w:val="VerbatimChar"/>
+        </w:rPr>
+        <w:t xml:space="preserve">thal</w:t>
+      </w:r>
+      <w:r>
+        <w:t xml:space="preserve"> </w:t>
+      </w:r>
+      <w:r>
+        <w:t xml:space="preserve">are optional because they are the fields most often missing</w:t>
+      </w:r>
+      <w:r>
+        <w:t xml:space="preserve"> </w:t>
+      </w:r>
+      <w:r>
+        <w:t xml:space="preserve">in practice, and the pipeline imputes them.</w:t>
+      </w:r>
+    </w:p>
+    <w:p>
+      <w:pPr>
+        <w:pStyle w:val="CaptionedFigure"/>
+      </w:pPr>
+      <w:r>
+        <w:drawing>
+          <wp:inline>
+            <wp:extent cx="5334000" cy="3333750"/>
+            <wp:effectExtent b="0" l="0" r="0" t="0"/>
+            <wp:docPr descr="Swagger UI" title="" id="55" name="Picture"/>
+            <a:graphic>
+              <a:graphicData uri="http://schemas.openxmlformats.org/drawingml/2006/picture">
+                <pic:pic>
+                  <pic:nvPicPr>
+                    <pic:cNvPr descr="screenshots/05_swagger_docs.png" id="56" name="Picture"/>
+                    <pic:cNvPicPr>
+                      <a:picLocks noChangeArrowheads="1" noChangeAspect="1"/>
+                    </pic:cNvPicPr>
+                  </pic:nvPicPr>
+                  <pic:blipFill>
+                    <a:blip r:embed="rId54"/>
                     <a:stretch>
                       <a:fillRect/>
                     </a:stretch>
@@ -4306,352 +4328,6 @@
         <w:t xml:space="preserve">endpoints.</w:t>
       </w:r>
     </w:p>
-    <w:tbl>
-      <w:tblPr>
-        <w:tblStyle w:val="FigureTable"/>
-        <w:tblW w:type="auto" w:w="0"/>
-        <w:jc w:val="center"/>
-        <w:tblLook w:firstRow="0" w:lastRow="0" w:firstColumn="0" w:lastColumn="0"/>
-      </w:tblPr>
-      <w:tblGrid>
-        <w:gridCol w:w="7920"/>
-      </w:tblGrid>
-      <w:tr>
-        <w:tc>
-          <w:tcPr/>
-          <w:p>
-            <w:pPr>
-              <w:pStyle w:val="Compact"/>
-              <w:jc w:val="center"/>
-            </w:pPr>
-            <w:r>
-              <w:t xml:space="preserve">kubectl resources</w:t>
-            </w:r>
-          </w:p>
-        </w:tc>
-      </w:tr>
-    </w:tbl>
-    <w:p>
-      <w:pPr>
-        <w:pStyle w:val="ImageCaption"/>
-      </w:pPr>
-      <w:r>
-        <w:t xml:space="preserve">kubectl resources</w:t>
-      </w:r>
-    </w:p>
-    <w:tbl>
-      <w:tblPr>
-        <w:tblStyle w:val="FigureTable"/>
-        <w:tblW w:type="auto" w:w="0"/>
-        <w:jc w:val="center"/>
-        <w:tblLook w:firstRow="0" w:lastRow="0" w:firstColumn="0" w:lastColumn="0"/>
-      </w:tblPr>
-      <w:tblGrid>
-        <w:gridCol w:w="7920"/>
-      </w:tblGrid>
-      <w:tr>
-        <w:tc>
-          <w:tcPr/>
-          <w:p>
-            <w:pPr>
-              <w:pStyle w:val="Compact"/>
-              <w:jc w:val="center"/>
-            </w:pPr>
-            <w:r>
-              <w:t xml:space="preserve">Prediction through the Kubernetes LoadBalancer</w:t>
-            </w:r>
-          </w:p>
-        </w:tc>
-      </w:tr>
-    </w:tbl>
-    <w:p>
-      <w:pPr>
-        <w:pStyle w:val="ImageCaption"/>
-      </w:pPr>
-      <w:r>
-        <w:t xml:space="preserve">Prediction through the Kubernetes LoadBalancer</w:t>
-      </w:r>
-    </w:p>
-    <w:bookmarkEnd w:id="54"/>
-    <w:bookmarkStart w:id="61" w:name="monitoring-and-logging"/>
-    <w:p>
-      <w:pPr>
-        <w:pStyle w:val="Heading1"/>
-      </w:pPr>
-      <w:r>
-        <w:t xml:space="preserve">11. Monitoring and logging</w:t>
-      </w:r>
-    </w:p>
-    <w:p>
-      <w:pPr>
-        <w:pStyle w:val="FirstParagraph"/>
-      </w:pPr>
-      <w:r>
-        <w:rPr>
-          <w:b/>
-          <w:bCs/>
-        </w:rPr>
-        <w:t xml:space="preserve">Logging.</w:t>
-      </w:r>
-      <w:r>
-        <w:t xml:space="preserve"> </w:t>
-      </w:r>
-      <w:r>
-        <w:t xml:space="preserve">An HTTP middleware writes one JSON line per request: timestamp, request id (also returned in the</w:t>
-      </w:r>
-      <w:r>
-        <w:t xml:space="preserve"> </w:t>
-      </w:r>
-      <w:r>
-        <w:rPr>
-          <w:rStyle w:val="VerbatimChar"/>
-        </w:rPr>
-        <w:t xml:space="preserve">x-request-id</w:t>
-      </w:r>
-      <w:r>
-        <w:t xml:space="preserve"> </w:t>
-      </w:r>
-      <w:r>
-        <w:t xml:space="preserve">header), method, path, status, latency in ms, and client. Each prediction also logs its label</w:t>
-      </w:r>
-      <w:r>
-        <w:t xml:space="preserve"> </w:t>
-      </w:r>
-      <w:r>
-        <w:t xml:space="preserve">and confidence. JSON logs can be read with</w:t>
-      </w:r>
-      <w:r>
-        <w:t xml:space="preserve"> </w:t>
-      </w:r>
-      <w:r>
-        <w:rPr>
-          <w:rStyle w:val="VerbatimChar"/>
-        </w:rPr>
-        <w:t xml:space="preserve">kubectl logs</w:t>
-      </w:r>
-      <w:r>
-        <w:t xml:space="preserve"> </w:t>
-      </w:r>
-      <w:r>
-        <w:t xml:space="preserve">or</w:t>
-      </w:r>
-      <w:r>
-        <w:t xml:space="preserve"> </w:t>
-      </w:r>
-      <w:r>
-        <w:rPr>
-          <w:rStyle w:val="VerbatimChar"/>
-        </w:rPr>
-        <w:t xml:space="preserve">docker compose logs</w:t>
-      </w:r>
-      <w:r>
-        <w:t xml:space="preserve"> </w:t>
-      </w:r>
-      <w:r>
-        <w:t xml:space="preserve">and can be shipped to</w:t>
-      </w:r>
-      <w:r>
-        <w:t xml:space="preserve"> </w:t>
-      </w:r>
-      <w:r>
-        <w:t xml:space="preserve">Loki or ELK without parsing rules.</w:t>
-      </w:r>
-    </w:p>
-    <w:p>
-      <w:pPr>
-        <w:pStyle w:val="BodyText"/>
-      </w:pPr>
-      <w:r>
-        <w:rPr>
-          <w:b/>
-          <w:bCs/>
-        </w:rPr>
-        <w:t xml:space="preserve">Metrics</w:t>
-      </w:r>
-      <w:r>
-        <w:t xml:space="preserve"> </w:t>
-      </w:r>
-      <w:r>
-        <w:t xml:space="preserve">(</w:t>
-      </w:r>
-      <w:r>
-        <w:rPr>
-          <w:rStyle w:val="VerbatimChar"/>
-        </w:rPr>
-        <w:t xml:space="preserve">/metrics</w:t>
-      </w:r>
-      <w:r>
-        <w:t xml:space="preserve">, Prometheus format):</w:t>
-      </w:r>
-      <w:r>
-        <w:t xml:space="preserve"> </w:t>
-      </w:r>
-      <w:r>
-        <w:rPr>
-          <w:rStyle w:val="VerbatimChar"/>
-        </w:rPr>
-        <w:t xml:space="preserve">heartrisk_http_requests_total{method,path,status}</w:t>
-      </w:r>
-      <w:r>
-        <w:t xml:space="preserve">,</w:t>
-      </w:r>
-      <w:r>
-        <w:t xml:space="preserve"> </w:t>
-      </w:r>
-      <w:r>
-        <w:rPr>
-          <w:rStyle w:val="VerbatimChar"/>
-        </w:rPr>
-        <w:t xml:space="preserve">heartrisk_http_request_duration_seconds</w:t>
-      </w:r>
-      <w:r>
-        <w:t xml:space="preserve"> </w:t>
-      </w:r>
-      <w:r>
-        <w:t xml:space="preserve">(histogram),</w:t>
-      </w:r>
-      <w:r>
-        <w:t xml:space="preserve"> </w:t>
-      </w:r>
-      <w:r>
-        <w:rPr>
-          <w:rStyle w:val="VerbatimChar"/>
-        </w:rPr>
-        <w:t xml:space="preserve">heartrisk_predictions_total{label}</w:t>
-      </w:r>
-      <w:r>
-        <w:t xml:space="preserve">,</w:t>
-      </w:r>
-      <w:r>
-        <w:t xml:space="preserve"> </w:t>
-      </w:r>
-      <w:r>
-        <w:rPr>
-          <w:rStyle w:val="VerbatimChar"/>
-        </w:rPr>
-        <w:t xml:space="preserve">heartrisk_prediction_confidence</w:t>
-      </w:r>
-      <w:r>
-        <w:t xml:space="preserve"> </w:t>
-      </w:r>
-      <w:r>
-        <w:t xml:space="preserve">(histogram) and</w:t>
-      </w:r>
-      <w:r>
-        <w:t xml:space="preserve"> </w:t>
-      </w:r>
-      <w:r>
-        <w:rPr>
-          <w:rStyle w:val="VerbatimChar"/>
-        </w:rPr>
-        <w:t xml:space="preserve">heartrisk_model_loaded{model_name,version}</w:t>
-      </w:r>
-      <w:r>
-        <w:t xml:space="preserve">.</w:t>
-      </w:r>
-    </w:p>
-    <w:p>
-      <w:pPr>
-        <w:pStyle w:val="BodyText"/>
-      </w:pPr>
-      <w:r>
-        <w:rPr>
-          <w:b/>
-          <w:bCs/>
-        </w:rPr>
-        <w:t xml:space="preserve">Dashboard.</w:t>
-      </w:r>
-      <w:r>
-        <w:t xml:space="preserve"> </w:t>
-      </w:r>
-      <w:r>
-        <w:rPr>
-          <w:rStyle w:val="VerbatimChar"/>
-        </w:rPr>
-        <w:t xml:space="preserve">docker compose up</w:t>
-      </w:r>
-      <w:r>
-        <w:t xml:space="preserve"> </w:t>
-      </w:r>
-      <w:r>
-        <w:t xml:space="preserve">starts the API, Prometheus (5-second scrape interval) and Grafana with the</w:t>
-      </w:r>
-      <w:r>
-        <w:t xml:space="preserve"> </w:t>
-      </w:r>
-      <w:r>
-        <w:t xml:space="preserve">datasource and dashboard already provisioned. Panels: requests/s, error rate, p95 latency, total</w:t>
-      </w:r>
-      <w:r>
-        <w:t xml:space="preserve"> </w:t>
-      </w:r>
-      <w:r>
-        <w:t xml:space="preserve">predictions, traffic by path and status, p50/p95/p99 latency, predicted class mix,</w:t>
-      </w:r>
-      <w:r>
-        <w:t xml:space="preserve"> </w:t>
-      </w:r>
-      <w:r>
-        <w:rPr>
-          <w:b/>
-          <w:bCs/>
-        </w:rPr>
-        <w:t xml:space="preserve">positive prediction</w:t>
-      </w:r>
-      <w:r>
-        <w:rPr>
-          <w:b/>
-          <w:bCs/>
-        </w:rPr>
-        <w:t xml:space="preserve"> </w:t>
-      </w:r>
-      <w:r>
-        <w:rPr>
-          <w:b/>
-          <w:bCs/>
-        </w:rPr>
-        <w:t xml:space="preserve">rate over time</w:t>
-      </w:r>
-      <w:r>
-        <w:t xml:space="preserve"> </w:t>
-      </w:r>
-      <w:r>
-        <w:t xml:space="preserve">(a simple prediction-drift signal: in production a sudden change away from the training</w:t>
-      </w:r>
-      <w:r>
-        <w:t xml:space="preserve"> </w:t>
-      </w:r>
-      <w:r>
-        <w:t xml:space="preserve">base rate of about 46% would trigger an investigation), and the confidence distribution (a rising share of</w:t>
-      </w:r>
-      <w:r>
-        <w:t xml:space="preserve"> </w:t>
-      </w:r>
-      <w:r>
-        <w:t xml:space="preserve">low-confidence predictions suggests input drift).</w:t>
-      </w:r>
-      <w:r>
-        <w:t xml:space="preserve"> </w:t>
-      </w:r>
-      <w:r>
-        <w:rPr>
-          <w:rStyle w:val="VerbatimChar"/>
-        </w:rPr>
-        <w:t xml:space="preserve">scripts/load_test.py</w:t>
-      </w:r>
-      <w:r>
-        <w:t xml:space="preserve"> </w:t>
-      </w:r>
-      <w:r>
-        <w:t xml:space="preserve">generates realistic traffic with a</w:t>
-      </w:r>
-      <w:r>
-        <w:t xml:space="preserve"> </w:t>
-      </w:r>
-      <w:r>
-        <w:t xml:space="preserve">configurable share of invalid payloads, which is how the screenshot below was produced.</w:t>
-      </w:r>
-    </w:p>
     <w:p>
       <w:pPr>
         <w:pStyle w:val="CaptionedFigure"/>
@@ -4659,20 +4335,410 @@
       <w:r>
         <w:drawing>
           <wp:inline>
-            <wp:extent cx="5334000" cy="3333750"/>
+            <wp:extent cx="5334000" cy="2133600"/>
             <wp:effectExtent b="0" l="0" r="0" t="0"/>
-            <wp:docPr descr="Grafana dashboard" title="" id="56" name="Picture"/>
+            <wp:docPr descr="kubectl resources" title="" id="58" name="Picture"/>
             <a:graphic>
               <a:graphicData uri="http://schemas.openxmlformats.org/drawingml/2006/picture">
                 <pic:pic>
                   <pic:nvPicPr>
-                    <pic:cNvPr descr="screenshots/06_grafana_dashboard.png" id="57" name="Picture"/>
+                    <pic:cNvPr descr="screenshots/09_k8s_resources.png" id="59" name="Picture"/>
                     <pic:cNvPicPr>
                       <a:picLocks noChangeArrowheads="1" noChangeAspect="1"/>
                     </pic:cNvPicPr>
                   </pic:nvPicPr>
                   <pic:blipFill>
-                    <a:blip r:embed="rId55"/>
+                    <a:blip r:embed="rId57"/>
+                    <a:stretch>
+                      <a:fillRect/>
+                    </a:stretch>
+                  </pic:blipFill>
+                  <pic:spPr bwMode="auto">
+                    <a:xfrm>
+                      <a:off x="0" y="0"/>
+                      <a:ext cx="5334000" cy="2133600"/>
+                    </a:xfrm>
+                    <a:prstGeom prst="rect">
+                      <a:avLst/>
+                    </a:prstGeom>
+                    <a:noFill/>
+                    <a:ln w="9525">
+                      <a:noFill/>
+                      <a:headEnd/>
+                      <a:tailEnd/>
+                    </a:ln>
+                  </pic:spPr>
+                </pic:pic>
+              </a:graphicData>
+            </a:graphic>
+          </wp:inline>
+        </w:drawing>
+      </w:r>
+    </w:p>
+    <w:p>
+      <w:pPr>
+        <w:pStyle w:val="ImageCaption"/>
+      </w:pPr>
+      <w:r>
+        <w:t xml:space="preserve">kubectl resources</w:t>
+      </w:r>
+    </w:p>
+    <w:p>
+      <w:pPr>
+        <w:pStyle w:val="CaptionedFigure"/>
+      </w:pPr>
+      <w:r>
+        <w:drawing>
+          <wp:inline>
+            <wp:extent cx="5334000" cy="3112545"/>
+            <wp:effectExtent b="0" l="0" r="0" t="0"/>
+            <wp:docPr descr="Prediction through the Kubernetes LoadBalancer" title="" id="61" name="Picture"/>
+            <a:graphic>
+              <a:graphicData uri="http://schemas.openxmlformats.org/drawingml/2006/picture">
+                <pic:pic>
+                  <pic:nvPicPr>
+                    <pic:cNvPr descr="screenshots/10_k8s_predict.png" id="62" name="Picture"/>
+                    <pic:cNvPicPr>
+                      <a:picLocks noChangeArrowheads="1" noChangeAspect="1"/>
+                    </pic:cNvPicPr>
+                  </pic:nvPicPr>
+                  <pic:blipFill>
+                    <a:blip r:embed="rId60"/>
+                    <a:stretch>
+                      <a:fillRect/>
+                    </a:stretch>
+                  </pic:blipFill>
+                  <pic:spPr bwMode="auto">
+                    <a:xfrm>
+                      <a:off x="0" y="0"/>
+                      <a:ext cx="5334000" cy="3112545"/>
+                    </a:xfrm>
+                    <a:prstGeom prst="rect">
+                      <a:avLst/>
+                    </a:prstGeom>
+                    <a:noFill/>
+                    <a:ln w="9525">
+                      <a:noFill/>
+                      <a:headEnd/>
+                      <a:tailEnd/>
+                    </a:ln>
+                  </pic:spPr>
+                </pic:pic>
+              </a:graphicData>
+            </a:graphic>
+          </wp:inline>
+        </w:drawing>
+      </w:r>
+    </w:p>
+    <w:p>
+      <w:pPr>
+        <w:pStyle w:val="ImageCaption"/>
+      </w:pPr>
+      <w:r>
+        <w:t xml:space="preserve">Prediction through the Kubernetes LoadBalancer</w:t>
+      </w:r>
+    </w:p>
+    <w:bookmarkEnd w:id="63"/>
+    <w:bookmarkStart w:id="70" w:name="monitoring-and-logging"/>
+    <w:p>
+      <w:pPr>
+        <w:pStyle w:val="Heading1"/>
+      </w:pPr>
+      <w:r>
+        <w:t xml:space="preserve">11. Monitoring and logging</w:t>
+      </w:r>
+    </w:p>
+    <w:p>
+      <w:pPr>
+        <w:pStyle w:val="FirstParagraph"/>
+      </w:pPr>
+      <w:r>
+        <w:rPr>
+          <w:b/>
+          <w:bCs/>
+        </w:rPr>
+        <w:t xml:space="preserve">Logging.</w:t>
+      </w:r>
+      <w:r>
+        <w:t xml:space="preserve"> </w:t>
+      </w:r>
+      <w:r>
+        <w:t xml:space="preserve">An HTTP middleware writes one JSON line per request: timestamp, request id (also returned in the</w:t>
+      </w:r>
+      <w:r>
+        <w:t xml:space="preserve"> </w:t>
+      </w:r>
+      <w:r>
+        <w:rPr>
+          <w:rStyle w:val="VerbatimChar"/>
+        </w:rPr>
+        <w:t xml:space="preserve">x-request-id</w:t>
+      </w:r>
+      <w:r>
+        <w:t xml:space="preserve"> </w:t>
+      </w:r>
+      <w:r>
+        <w:t xml:space="preserve">header), method, path, status, latency in ms, and client. Each prediction also logs its label</w:t>
+      </w:r>
+      <w:r>
+        <w:t xml:space="preserve"> </w:t>
+      </w:r>
+      <w:r>
+        <w:t xml:space="preserve">and confidence. JSON logs can be read with</w:t>
+      </w:r>
+      <w:r>
+        <w:t xml:space="preserve"> </w:t>
+      </w:r>
+      <w:r>
+        <w:rPr>
+          <w:rStyle w:val="VerbatimChar"/>
+        </w:rPr>
+        <w:t xml:space="preserve">kubectl logs</w:t>
+      </w:r>
+      <w:r>
+        <w:t xml:space="preserve"> </w:t>
+      </w:r>
+      <w:r>
+        <w:t xml:space="preserve">or</w:t>
+      </w:r>
+      <w:r>
+        <w:t xml:space="preserve"> </w:t>
+      </w:r>
+      <w:r>
+        <w:rPr>
+          <w:rStyle w:val="VerbatimChar"/>
+        </w:rPr>
+        <w:t xml:space="preserve">docker compose logs</w:t>
+      </w:r>
+      <w:r>
+        <w:t xml:space="preserve"> </w:t>
+      </w:r>
+      <w:r>
+        <w:t xml:space="preserve">and can be shipped to</w:t>
+      </w:r>
+      <w:r>
+        <w:t xml:space="preserve"> </w:t>
+      </w:r>
+      <w:r>
+        <w:t xml:space="preserve">Loki or ELK without parsing rules.</w:t>
+      </w:r>
+    </w:p>
+    <w:p>
+      <w:pPr>
+        <w:pStyle w:val="BodyText"/>
+      </w:pPr>
+      <w:r>
+        <w:rPr>
+          <w:b/>
+          <w:bCs/>
+        </w:rPr>
+        <w:t xml:space="preserve">Metrics</w:t>
+      </w:r>
+      <w:r>
+        <w:t xml:space="preserve"> </w:t>
+      </w:r>
+      <w:r>
+        <w:t xml:space="preserve">(</w:t>
+      </w:r>
+      <w:r>
+        <w:rPr>
+          <w:rStyle w:val="VerbatimChar"/>
+        </w:rPr>
+        <w:t xml:space="preserve">/metrics</w:t>
+      </w:r>
+      <w:r>
+        <w:t xml:space="preserve">, Prometheus format):</w:t>
+      </w:r>
+      <w:r>
+        <w:t xml:space="preserve"> </w:t>
+      </w:r>
+      <w:r>
+        <w:rPr>
+          <w:rStyle w:val="VerbatimChar"/>
+        </w:rPr>
+        <w:t xml:space="preserve">heartrisk_http_requests_total{method,path,status}</w:t>
+      </w:r>
+      <w:r>
+        <w:t xml:space="preserve">,</w:t>
+      </w:r>
+      <w:r>
+        <w:t xml:space="preserve"> </w:t>
+      </w:r>
+      <w:r>
+        <w:rPr>
+          <w:rStyle w:val="VerbatimChar"/>
+        </w:rPr>
+        <w:t xml:space="preserve">heartrisk_http_request_duration_seconds</w:t>
+      </w:r>
+      <w:r>
+        <w:t xml:space="preserve"> </w:t>
+      </w:r>
+      <w:r>
+        <w:t xml:space="preserve">(histogram),</w:t>
+      </w:r>
+      <w:r>
+        <w:t xml:space="preserve"> </w:t>
+      </w:r>
+      <w:r>
+        <w:rPr>
+          <w:rStyle w:val="VerbatimChar"/>
+        </w:rPr>
+        <w:t xml:space="preserve">heartrisk_predictions_total{label}</w:t>
+      </w:r>
+      <w:r>
+        <w:t xml:space="preserve">,</w:t>
+      </w:r>
+      <w:r>
+        <w:t xml:space="preserve"> </w:t>
+      </w:r>
+      <w:r>
+        <w:rPr>
+          <w:rStyle w:val="VerbatimChar"/>
+        </w:rPr>
+        <w:t xml:space="preserve">heartrisk_prediction_confidence</w:t>
+      </w:r>
+      <w:r>
+        <w:t xml:space="preserve"> </w:t>
+      </w:r>
+      <w:r>
+        <w:t xml:space="preserve">(histogram) and</w:t>
+      </w:r>
+      <w:r>
+        <w:t xml:space="preserve"> </w:t>
+      </w:r>
+      <w:r>
+        <w:rPr>
+          <w:rStyle w:val="VerbatimChar"/>
+        </w:rPr>
+        <w:t xml:space="preserve">heartrisk_model_loaded{model_name,version}</w:t>
+      </w:r>
+      <w:r>
+        <w:t xml:space="preserve">.</w:t>
+      </w:r>
+    </w:p>
+    <w:p>
+      <w:pPr>
+        <w:pStyle w:val="BodyText"/>
+      </w:pPr>
+      <w:r>
+        <w:rPr>
+          <w:b/>
+          <w:bCs/>
+        </w:rPr>
+        <w:t xml:space="preserve">Dashboard.</w:t>
+      </w:r>
+      <w:r>
+        <w:t xml:space="preserve"> </w:t>
+      </w:r>
+      <w:r>
+        <w:rPr>
+          <w:rStyle w:val="VerbatimChar"/>
+        </w:rPr>
+        <w:t xml:space="preserve">docker compose up</w:t>
+      </w:r>
+      <w:r>
+        <w:t xml:space="preserve"> </w:t>
+      </w:r>
+      <w:r>
+        <w:t xml:space="preserve">starts the API, Prometheus (5-second scrape interval) and Grafana with the</w:t>
+      </w:r>
+      <w:r>
+        <w:t xml:space="preserve"> </w:t>
+      </w:r>
+      <w:r>
+        <w:t xml:space="preserve">datasource and dashboard already provisioned. Panels: requests/s, error rate, p95 latency, total</w:t>
+      </w:r>
+      <w:r>
+        <w:t xml:space="preserve"> </w:t>
+      </w:r>
+      <w:r>
+        <w:t xml:space="preserve">predictions, traffic by path and status, p50/p95/p99 latency, predicted class mix,</w:t>
+      </w:r>
+      <w:r>
+        <w:t xml:space="preserve"> </w:t>
+      </w:r>
+      <w:r>
+        <w:rPr>
+          <w:b/>
+          <w:bCs/>
+        </w:rPr>
+        <w:t xml:space="preserve">positive prediction</w:t>
+      </w:r>
+      <w:r>
+        <w:rPr>
+          <w:b/>
+          <w:bCs/>
+        </w:rPr>
+        <w:t xml:space="preserve"> </w:t>
+      </w:r>
+      <w:r>
+        <w:rPr>
+          <w:b/>
+          <w:bCs/>
+        </w:rPr>
+        <w:t xml:space="preserve">rate over time</w:t>
+      </w:r>
+      <w:r>
+        <w:t xml:space="preserve"> </w:t>
+      </w:r>
+      <w:r>
+        <w:t xml:space="preserve">(a simple prediction-drift signal: in production a sudden change away from the training</w:t>
+      </w:r>
+      <w:r>
+        <w:t xml:space="preserve"> </w:t>
+      </w:r>
+      <w:r>
+        <w:t xml:space="preserve">base rate of about 46% would trigger an investigation), and the confidence distribution (a rising share of</w:t>
+      </w:r>
+      <w:r>
+        <w:t xml:space="preserve"> </w:t>
+      </w:r>
+      <w:r>
+        <w:t xml:space="preserve">low-confidence predictions suggests input drift).</w:t>
+      </w:r>
+      <w:r>
+        <w:t xml:space="preserve"> </w:t>
+      </w:r>
+      <w:r>
+        <w:rPr>
+          <w:rStyle w:val="VerbatimChar"/>
+        </w:rPr>
+        <w:t xml:space="preserve">scripts/load_test.py</w:t>
+      </w:r>
+      <w:r>
+        <w:t xml:space="preserve"> </w:t>
+      </w:r>
+      <w:r>
+        <w:t xml:space="preserve">generates realistic traffic with a</w:t>
+      </w:r>
+      <w:r>
+        <w:t xml:space="preserve"> </w:t>
+      </w:r>
+      <w:r>
+        <w:t xml:space="preserve">configurable share of invalid payloads, which is how the screenshot below was produced.</w:t>
+      </w:r>
+    </w:p>
+    <w:p>
+      <w:pPr>
+        <w:pStyle w:val="CaptionedFigure"/>
+      </w:pPr>
+      <w:r>
+        <w:drawing>
+          <wp:inline>
+            <wp:extent cx="5334000" cy="3333750"/>
+            <wp:effectExtent b="0" l="0" r="0" t="0"/>
+            <wp:docPr descr="Grafana dashboard" title="" id="65" name="Picture"/>
+            <a:graphic>
+              <a:graphicData uri="http://schemas.openxmlformats.org/drawingml/2006/picture">
+                <pic:pic>
+                  <pic:nvPicPr>
+                    <pic:cNvPr descr="screenshots/06_grafana_dashboard.png" id="66" name="Picture"/>
+                    <pic:cNvPicPr>
+                      <a:picLocks noChangeArrowheads="1" noChangeAspect="1"/>
+                    </pic:cNvPicPr>
+                  </pic:nvPicPr>
+                  <pic:blipFill>
+                    <a:blip r:embed="rId64"/>
                     <a:stretch>
                       <a:fillRect/>
                     </a:stretch>
@@ -4716,18 +4782,18 @@
           <wp:inline>
             <wp:extent cx="4267200" cy="2133600"/>
             <wp:effectExtent b="0" l="0" r="0" t="0"/>
-            <wp:docPr descr="Prometheus targets" title="" id="59" name="Picture"/>
+            <wp:docPr descr="Prometheus targets" title="" id="68" name="Picture"/>
             <a:graphic>
               <a:graphicData uri="http://schemas.openxmlformats.org/drawingml/2006/picture">
                 <pic:pic>
                   <pic:nvPicPr>
-                    <pic:cNvPr descr="screenshots/07_prometheus_targets.png" id="60" name="Picture"/>
+                    <pic:cNvPr descr="screenshots/07_prometheus_targets.png" id="69" name="Picture"/>
                     <pic:cNvPicPr>
                       <a:picLocks noChangeArrowheads="1" noChangeAspect="1"/>
                     </pic:cNvPicPr>
                   </pic:nvPicPr>
                   <pic:blipFill>
-                    <a:blip r:embed="rId58"/>
+                    <a:blip r:embed="rId67"/>
                     <a:stretch>
                       <a:fillRect/>
                     </a:stretch>
@@ -4762,8 +4828,8 @@
         <w:t xml:space="preserve">Prometheus targets</w:t>
       </w:r>
     </w:p>
-    <w:bookmarkEnd w:id="61"/>
-    <w:bookmarkStart w:id="62" w:name="X870ab7715e9583e7fe998ddcabad63ca335879b"/>
+    <w:bookmarkEnd w:id="70"/>
+    <w:bookmarkStart w:id="71" w:name="X870ab7715e9583e7fe998ddcabad63ca335879b"/>
     <w:p>
       <w:pPr>
         <w:pStyle w:val="Heading1"/>
@@ -4921,8 +4987,8 @@
         <w:t xml:space="preserve">with training statistics (e.g. a PSI metric) would add data-drift detection.</w:t>
       </w:r>
     </w:p>
-    <w:bookmarkEnd w:id="62"/>
-    <w:bookmarkStart w:id="63" w:name="deliverables-checklist"/>
+    <w:bookmarkEnd w:id="71"/>
+    <w:bookmarkStart w:id="72" w:name="deliverables-checklist"/>
     <w:p>
       <w:pPr>
         <w:pStyle w:val="Heading1"/>
@@ -5354,7 +5420,7 @@
         </w:tc>
       </w:tr>
     </w:tbl>
-    <w:bookmarkEnd w:id="63"/>
+    <w:bookmarkEnd w:id="72"/>
     <w:sectPr>
       <w:footnotePr>
         <w:numRestart w:val="eachSect"/>

</xml_diff>

<commit_message>
docs: update report with native docker-desktop kubernetes verification
</commit_message>
<xml_diff>
--- a/report/REPORT.docx
+++ b/report/REPORT.docx
@@ -4335,7 +4335,7 @@
       <w:r>
         <w:drawing>
           <wp:inline>
-            <wp:extent cx="5334000" cy="2133600"/>
+            <wp:extent cx="5334000" cy="2328406"/>
             <wp:effectExtent b="0" l="0" r="0" t="0"/>
             <wp:docPr descr="kubectl resources" title="" id="58" name="Picture"/>
             <a:graphic>
@@ -4356,7 +4356,7 @@
                   <pic:spPr bwMode="auto">
                     <a:xfrm>
                       <a:off x="0" y="0"/>
-                      <a:ext cx="5334000" cy="2133600"/>
+                      <a:ext cx="5334000" cy="2328406"/>
                     </a:xfrm>
                     <a:prstGeom prst="rect">
                       <a:avLst/>

</xml_diff>

<commit_message>
docs: include video walkthrough link in report deliverables
</commit_message>
<xml_diff>
--- a/report/REPORT.docx
+++ b/report/REPORT.docx
@@ -60,7 +60,7 @@
         </w:p>
       </w:sdtContent>
     </w:sdt>
-    <w:bookmarkStart w:id="9" w:name="summary"/>
+    <w:bookmarkStart w:id="10" w:name="summary"/>
     <w:p>
       <w:pPr>
         <w:pStyle w:val="Heading1"/>
@@ -195,6 +195,50 @@
               <w:pStyle w:val="Compact"/>
             </w:pPr>
             <w:r>
+              <w:t xml:space="preserve">Video walkthrough</w:t>
+            </w:r>
+          </w:p>
+        </w:tc>
+        <w:tc>
+          <w:tcPr/>
+          <w:p>
+            <w:pPr>
+              <w:pStyle w:val="Compact"/>
+            </w:pPr>
+            <w:hyperlink r:id="rId9">
+              <w:r>
+                <w:rPr>
+                  <w:rStyle w:val="Hyperlink"/>
+                </w:rPr>
+                <w:t xml:space="preserve">Google Drive Video Link</w:t>
+              </w:r>
+            </w:hyperlink>
+            <w:r>
+              <w:t xml:space="preserve"> </w:t>
+            </w:r>
+            <w:r>
+              <w:t xml:space="preserve">(</w:t>
+            </w:r>
+            <w:r>
+              <w:rPr>
+                <w:rStyle w:val="VerbatimChar"/>
+              </w:rPr>
+              <w:t xml:space="preserve">https://drive.google.com/file/d/1B5Q_ZFFDnhU_ME6vB6uXpXcSQjFW-JAG/view?usp=sharing</w:t>
+            </w:r>
+            <w:r>
+              <w:t xml:space="preserve">)</w:t>
+            </w:r>
+          </w:p>
+        </w:tc>
+      </w:tr>
+      <w:tr>
+        <w:tc>
+          <w:tcPr/>
+          <w:p>
+            <w:pPr>
+              <w:pStyle w:val="Compact"/>
+            </w:pPr>
+            <w:r>
               <w:t xml:space="preserve">Champion model</w:t>
             </w:r>
           </w:p>
@@ -340,8 +384,8 @@
         </w:tc>
       </w:tr>
     </w:tbl>
-    <w:bookmarkEnd w:id="9"/>
-    <w:bookmarkStart w:id="10" w:name="setup-and-installation"/>
+    <w:bookmarkEnd w:id="10"/>
+    <w:bookmarkStart w:id="11" w:name="setup-and-installation"/>
     <w:p>
       <w:pPr>
         <w:pStyle w:val="Heading1"/>
@@ -589,8 +633,8 @@
         <w:t xml:space="preserve">reports/, screenshots/   figures, EDA summary, model comparison, screenshots</w:t>
       </w:r>
     </w:p>
-    <w:bookmarkEnd w:id="10"/>
-    <w:bookmarkStart w:id="14" w:name="architecture"/>
+    <w:bookmarkEnd w:id="11"/>
+    <w:bookmarkStart w:id="15" w:name="architecture"/>
     <w:p>
       <w:pPr>
         <w:pStyle w:val="Heading1"/>
@@ -608,18 +652,18 @@
           <wp:inline>
             <wp:extent cx="5334000" cy="3243980"/>
             <wp:effectExtent b="0" l="0" r="0" t="0"/>
-            <wp:docPr descr="System architecture" title="" id="12" name="Picture"/>
+            <wp:docPr descr="System architecture" title="" id="13" name="Picture"/>
             <a:graphic>
               <a:graphicData uri="http://schemas.openxmlformats.org/drawingml/2006/picture">
                 <pic:pic>
                   <pic:nvPicPr>
-                    <pic:cNvPr descr="reports/figures/architecture.png" id="13" name="Picture"/>
+                    <pic:cNvPr descr="reports/figures/architecture.png" id="14" name="Picture"/>
                     <pic:cNvPicPr>
                       <a:picLocks noChangeArrowheads="1" noChangeAspect="1"/>
                     </pic:cNvPicPr>
                   </pic:nvPicPr>
                   <pic:blipFill>
-                    <a:blip r:embed="rId11"/>
+                    <a:blip r:embed="rId12"/>
                     <a:stretch>
                       <a:fillRect/>
                     </a:stretch>
@@ -756,8 +800,8 @@
         <w:t xml:space="preserve">every request is logged as structured JSON.</w:t>
       </w:r>
     </w:p>
-    <w:bookmarkEnd w:id="14"/>
-    <w:bookmarkStart w:id="15" w:name="data-acquisition-and-cleaning"/>
+    <w:bookmarkEnd w:id="15"/>
+    <w:bookmarkStart w:id="16" w:name="data-acquisition-and-cleaning"/>
     <w:p>
       <w:pPr>
         <w:pStyle w:val="Heading1"/>
@@ -1026,8 +1070,8 @@
         <w:t xml:space="preserve">training.</w:t>
       </w:r>
     </w:p>
-    <w:bookmarkEnd w:id="15"/>
-    <w:bookmarkStart w:id="34" w:name="exploratory-data-analysis"/>
+    <w:bookmarkEnd w:id="16"/>
+    <w:bookmarkStart w:id="35" w:name="exploratory-data-analysis"/>
     <w:p>
       <w:pPr>
         <w:pStyle w:val="Heading1"/>
@@ -1045,18 +1089,18 @@
           <wp:inline>
             <wp:extent cx="2400300" cy="1991931"/>
             <wp:effectExtent b="0" l="0" r="0" t="0"/>
-            <wp:docPr descr="Class balance" title="" id="17" name="Picture"/>
+            <wp:docPr descr="Class balance" title="" id="18" name="Picture"/>
             <a:graphic>
               <a:graphicData uri="http://schemas.openxmlformats.org/drawingml/2006/picture">
                 <pic:pic>
                   <pic:nvPicPr>
-                    <pic:cNvPr descr="reports/figures/eda_class_balance.png" id="18" name="Picture"/>
+                    <pic:cNvPr descr="reports/figures/eda_class_balance.png" id="19" name="Picture"/>
                     <pic:cNvPicPr>
                       <a:picLocks noChangeArrowheads="1" noChangeAspect="1"/>
                     </pic:cNvPicPr>
                   </pic:nvPicPr>
                   <pic:blipFill>
-                    <a:blip r:embed="rId16"/>
+                    <a:blip r:embed="rId17"/>
                     <a:stretch>
                       <a:fillRect/>
                     </a:stretch>
@@ -1090,18 +1134,18 @@
           <wp:inline>
             <wp:extent cx="2773680" cy="1552696"/>
             <wp:effectExtent b="0" l="0" r="0" t="0"/>
-            <wp:docPr descr="Missing values" title="" id="20" name="Picture"/>
+            <wp:docPr descr="Missing values" title="" id="21" name="Picture"/>
             <a:graphic>
               <a:graphicData uri="http://schemas.openxmlformats.org/drawingml/2006/picture">
                 <pic:pic>
                   <pic:nvPicPr>
-                    <pic:cNvPr descr="reports/figures/eda_missing_values.png" id="21" name="Picture"/>
+                    <pic:cNvPr descr="reports/figures/eda_missing_values.png" id="22" name="Picture"/>
                     <pic:cNvPicPr>
                       <a:picLocks noChangeArrowheads="1" noChangeAspect="1"/>
                     </pic:cNvPicPr>
                   </pic:nvPicPr>
                   <pic:blipFill>
-                    <a:blip r:embed="rId19"/>
+                    <a:blip r:embed="rId20"/>
                     <a:stretch>
                       <a:fillRect/>
                     </a:stretch>
@@ -1157,18 +1201,18 @@
           <wp:inline>
             <wp:extent cx="5334000" cy="2949839"/>
             <wp:effectExtent b="0" l="0" r="0" t="0"/>
-            <wp:docPr descr="Numeric feature distributions by diagnosis" title="" id="23" name="Picture"/>
+            <wp:docPr descr="Numeric feature distributions by diagnosis" title="" id="24" name="Picture"/>
             <a:graphic>
               <a:graphicData uri="http://schemas.openxmlformats.org/drawingml/2006/picture">
                 <pic:pic>
                   <pic:nvPicPr>
-                    <pic:cNvPr descr="reports/figures/eda_numeric_histograms.png" id="24" name="Picture"/>
+                    <pic:cNvPr descr="reports/figures/eda_numeric_histograms.png" id="25" name="Picture"/>
                     <pic:cNvPicPr>
                       <a:picLocks noChangeArrowheads="1" noChangeAspect="1"/>
                     </pic:cNvPicPr>
                   </pic:nvPicPr>
                   <pic:blipFill>
-                    <a:blip r:embed="rId22"/>
+                    <a:blip r:embed="rId23"/>
                     <a:stretch>
                       <a:fillRect/>
                     </a:stretch>
@@ -1301,18 +1345,18 @@
           <wp:inline>
             <wp:extent cx="5334000" cy="2460995"/>
             <wp:effectExtent b="0" l="0" r="0" t="0"/>
-            <wp:docPr descr="Disease rate per category" title="" id="26" name="Picture"/>
+            <wp:docPr descr="Disease rate per category" title="" id="27" name="Picture"/>
             <a:graphic>
               <a:graphicData uri="http://schemas.openxmlformats.org/drawingml/2006/picture">
                 <pic:pic>
                   <pic:nvPicPr>
-                    <pic:cNvPr descr="reports/figures/eda_categorical_rates.png" id="27" name="Picture"/>
+                    <pic:cNvPr descr="reports/figures/eda_categorical_rates.png" id="28" name="Picture"/>
                     <pic:cNvPicPr>
                       <a:picLocks noChangeArrowheads="1" noChangeAspect="1"/>
                     </pic:cNvPicPr>
                   </pic:nvPicPr>
                   <pic:blipFill>
-                    <a:blip r:embed="rId25"/>
+                    <a:blip r:embed="rId26"/>
                     <a:stretch>
                       <a:fillRect/>
                     </a:stretch>
@@ -1474,18 +1518,18 @@
           <wp:inline>
             <wp:extent cx="4267200" cy="3827869"/>
             <wp:effectExtent b="0" l="0" r="0" t="0"/>
-            <wp:docPr descr="Spearman correlation matrix" title="" id="29" name="Picture"/>
+            <wp:docPr descr="Spearman correlation matrix" title="" id="30" name="Picture"/>
             <a:graphic>
               <a:graphicData uri="http://schemas.openxmlformats.org/drawingml/2006/picture">
                 <pic:pic>
                   <pic:nvPicPr>
-                    <pic:cNvPr descr="reports/figures/eda_correlation_heatmap.png" id="30" name="Picture"/>
+                    <pic:cNvPr descr="reports/figures/eda_correlation_heatmap.png" id="31" name="Picture"/>
                     <pic:cNvPicPr>
                       <a:picLocks noChangeArrowheads="1" noChangeAspect="1"/>
                     </pic:cNvPicPr>
                   </pic:nvPicPr>
                   <pic:blipFill>
-                    <a:blip r:embed="rId28"/>
+                    <a:blip r:embed="rId29"/>
                     <a:stretch>
                       <a:fillRect/>
                     </a:stretch>
@@ -1739,18 +1783,18 @@
           <wp:inline>
             <wp:extent cx="3200400" cy="2407297"/>
             <wp:effectExtent b="0" l="0" r="0" t="0"/>
-            <wp:docPr descr="Engineered heart-rate reserve ratio" title="" id="32" name="Picture"/>
+            <wp:docPr descr="Engineered heart-rate reserve ratio" title="" id="33" name="Picture"/>
             <a:graphic>
               <a:graphicData uri="http://schemas.openxmlformats.org/drawingml/2006/picture">
                 <pic:pic>
                   <pic:nvPicPr>
-                    <pic:cNvPr descr="reports/figures/eda_hr_reserve_ratio.png" id="33" name="Picture"/>
+                    <pic:cNvPr descr="reports/figures/eda_hr_reserve_ratio.png" id="34" name="Picture"/>
                     <pic:cNvPicPr>
                       <a:picLocks noChangeArrowheads="1" noChangeAspect="1"/>
                     </pic:cNvPicPr>
                   </pic:nvPicPr>
                   <pic:blipFill>
-                    <a:blip r:embed="rId31"/>
+                    <a:blip r:embed="rId32"/>
                     <a:stretch>
                       <a:fillRect/>
                     </a:stretch>
@@ -1785,8 +1829,8 @@
         <w:t xml:space="preserve">Engineered heart-rate reserve ratio</w:t>
       </w:r>
     </w:p>
-    <w:bookmarkEnd w:id="34"/>
-    <w:bookmarkStart w:id="44" w:name="Xa799d93673afa10bf90c9043574061a98caadb1"/>
+    <w:bookmarkEnd w:id="35"/>
+    <w:bookmarkStart w:id="45" w:name="Xa799d93673afa10bf90c9043574061a98caadb1"/>
     <w:p>
       <w:pPr>
         <w:pStyle w:val="Heading1"/>
@@ -2646,18 +2690,18 @@
           <wp:inline>
             <wp:extent cx="4000500" cy="2451919"/>
             <wp:effectExtent b="0" l="0" r="0" t="0"/>
-            <wp:docPr descr="Model comparison" title="" id="36" name="Picture"/>
+            <wp:docPr descr="Model comparison" title="" id="37" name="Picture"/>
             <a:graphic>
               <a:graphicData uri="http://schemas.openxmlformats.org/drawingml/2006/picture">
                 <pic:pic>
                   <pic:nvPicPr>
-                    <pic:cNvPr descr="reports/figures/model_comparison.png" id="37" name="Picture"/>
+                    <pic:cNvPr descr="reports/figures/model_comparison.png" id="38" name="Picture"/>
                     <pic:cNvPicPr>
                       <a:picLocks noChangeArrowheads="1" noChangeAspect="1"/>
                     </pic:cNvPicPr>
                   </pic:nvPicPr>
                   <pic:blipFill>
-                    <a:blip r:embed="rId35"/>
+                    <a:blip r:embed="rId36"/>
                     <a:stretch>
                       <a:fillRect/>
                     </a:stretch>
@@ -2774,18 +2818,18 @@
           <wp:inline>
             <wp:extent cx="2560320" cy="2600403"/>
             <wp:effectExtent b="0" l="0" r="0" t="0"/>
-            <wp:docPr descr="ROC curve" title="" id="39" name="Picture"/>
+            <wp:docPr descr="ROC curve" title="" id="40" name="Picture"/>
             <a:graphic>
               <a:graphicData uri="http://schemas.openxmlformats.org/drawingml/2006/picture">
                 <pic:pic>
                   <pic:nvPicPr>
-                    <pic:cNvPr descr="reports/figures/roc_logistic_regression.png" id="40" name="Picture"/>
+                    <pic:cNvPr descr="reports/figures/roc_logistic_regression.png" id="41" name="Picture"/>
                     <pic:cNvPicPr>
                       <a:picLocks noChangeArrowheads="1" noChangeAspect="1"/>
                     </pic:cNvPicPr>
                   </pic:nvPicPr>
                   <pic:blipFill>
-                    <a:blip r:embed="rId38"/>
+                    <a:blip r:embed="rId39"/>
                     <a:stretch>
                       <a:fillRect/>
                     </a:stretch>
@@ -2819,18 +2863,18 @@
           <wp:inline>
             <wp:extent cx="2560320" cy="2009713"/>
             <wp:effectExtent b="0" l="0" r="0" t="0"/>
-            <wp:docPr descr="Confusion matrix" title="" id="42" name="Picture"/>
+            <wp:docPr descr="Confusion matrix" title="" id="43" name="Picture"/>
             <a:graphic>
               <a:graphicData uri="http://schemas.openxmlformats.org/drawingml/2006/picture">
                 <pic:pic>
                   <pic:nvPicPr>
-                    <pic:cNvPr descr="reports/figures/confusion_logistic_regression.png" id="43" name="Picture"/>
+                    <pic:cNvPr descr="reports/figures/confusion_logistic_regression.png" id="44" name="Picture"/>
                     <pic:cNvPicPr>
                       <a:picLocks noChangeArrowheads="1" noChangeAspect="1"/>
                     </pic:cNvPicPr>
                   </pic:nvPicPr>
                   <pic:blipFill>
-                    <a:blip r:embed="rId41"/>
+                    <a:blip r:embed="rId42"/>
                     <a:stretch>
                       <a:fillRect/>
                     </a:stretch>
@@ -2857,8 +2901,8 @@
         </w:drawing>
       </w:r>
     </w:p>
-    <w:bookmarkEnd w:id="44"/>
-    <w:bookmarkStart w:id="48" w:name="experiment-tracking-mlflow"/>
+    <w:bookmarkEnd w:id="45"/>
+    <w:bookmarkStart w:id="49" w:name="experiment-tracking-mlflow"/>
     <w:p>
       <w:pPr>
         <w:pStyle w:val="Heading1"/>
@@ -3117,18 +3161,18 @@
           <wp:inline>
             <wp:extent cx="5334000" cy="3137647"/>
             <wp:effectExtent b="0" l="0" r="0" t="0"/>
-            <wp:docPr descr="MLflow experiment view" title="" id="46" name="Picture"/>
+            <wp:docPr descr="MLflow experiment view" title="" id="47" name="Picture"/>
             <a:graphic>
               <a:graphicData uri="http://schemas.openxmlformats.org/drawingml/2006/picture">
                 <pic:pic>
                   <pic:nvPicPr>
-                    <pic:cNvPr descr="screenshots/03_mlflow_experiments.png" id="47" name="Picture"/>
+                    <pic:cNvPr descr="screenshots/03_mlflow_experiments.png" id="48" name="Picture"/>
                     <pic:cNvPicPr>
                       <a:picLocks noChangeArrowheads="1" noChangeAspect="1"/>
                     </pic:cNvPicPr>
                   </pic:nvPicPr>
                   <pic:blipFill>
-                    <a:blip r:embed="rId45"/>
+                    <a:blip r:embed="rId46"/>
                     <a:stretch>
                       <a:fillRect/>
                     </a:stretch>
@@ -3163,8 +3207,8 @@
         <w:t xml:space="preserve">MLflow experiment view</w:t>
       </w:r>
     </w:p>
-    <w:bookmarkEnd w:id="48"/>
-    <w:bookmarkStart w:id="49" w:name="packaging-reproducibility-and-testing"/>
+    <w:bookmarkEnd w:id="49"/>
+    <w:bookmarkStart w:id="50" w:name="packaging-reproducibility-and-testing"/>
     <w:p>
       <w:pPr>
         <w:pStyle w:val="Heading1"/>
@@ -3440,8 +3484,8 @@
         <w:t xml:space="preserve">The tests use a synthetic fixture dataset, so they need no network access and run in about 2 seconds.</w:t>
       </w:r>
     </w:p>
-    <w:bookmarkEnd w:id="49"/>
-    <w:bookmarkStart w:id="53" w:name="cicd-pipeline-github-actions"/>
+    <w:bookmarkEnd w:id="50"/>
+    <w:bookmarkStart w:id="54" w:name="cicd-pipeline-github-actions"/>
     <w:p>
       <w:pPr>
         <w:pStyle w:val="Heading1"/>
@@ -3821,18 +3865,18 @@
           <wp:inline>
             <wp:extent cx="5334000" cy="5750718"/>
             <wp:effectExtent b="0" l="0" r="0" t="0"/>
-            <wp:docPr descr="GitHub Actions run" title="" id="51" name="Picture"/>
+            <wp:docPr descr="GitHub Actions run" title="" id="52" name="Picture"/>
             <a:graphic>
               <a:graphicData uri="http://schemas.openxmlformats.org/drawingml/2006/picture">
                 <pic:pic>
                   <pic:nvPicPr>
-                    <pic:cNvPr descr="screenshots/01_github_actions_pipeline.png" id="52" name="Picture"/>
+                    <pic:cNvPr descr="screenshots/01_github_actions_pipeline.png" id="53" name="Picture"/>
                     <pic:cNvPicPr>
                       <a:picLocks noChangeArrowheads="1" noChangeAspect="1"/>
                     </pic:cNvPicPr>
                   </pic:nvPicPr>
                   <pic:blipFill>
-                    <a:blip r:embed="rId50"/>
+                    <a:blip r:embed="rId51"/>
                     <a:stretch>
                       <a:fillRect/>
                     </a:stretch>
@@ -3867,8 +3911,8 @@
         <w:t xml:space="preserve">GitHub Actions run</w:t>
       </w:r>
     </w:p>
-    <w:bookmarkEnd w:id="53"/>
-    <w:bookmarkStart w:id="63" w:name="containerisation-and-deployment"/>
+    <w:bookmarkEnd w:id="54"/>
+    <w:bookmarkStart w:id="64" w:name="containerisation-and-deployment"/>
     <w:p>
       <w:pPr>
         <w:pStyle w:val="Heading1"/>
@@ -4061,18 +4105,18 @@
           <wp:inline>
             <wp:extent cx="5334000" cy="3333750"/>
             <wp:effectExtent b="0" l="0" r="0" t="0"/>
-            <wp:docPr descr="Swagger UI" title="" id="55" name="Picture"/>
+            <wp:docPr descr="Swagger UI" title="" id="56" name="Picture"/>
             <a:graphic>
               <a:graphicData uri="http://schemas.openxmlformats.org/drawingml/2006/picture">
                 <pic:pic>
                   <pic:nvPicPr>
-                    <pic:cNvPr descr="screenshots/05_swagger_docs.png" id="56" name="Picture"/>
+                    <pic:cNvPr descr="screenshots/05_swagger_docs.png" id="57" name="Picture"/>
                     <pic:cNvPicPr>
                       <a:picLocks noChangeArrowheads="1" noChangeAspect="1"/>
                     </pic:cNvPicPr>
                   </pic:nvPicPr>
                   <pic:blipFill>
-                    <a:blip r:embed="rId54"/>
+                    <a:blip r:embed="rId55"/>
                     <a:stretch>
                       <a:fillRect/>
                     </a:stretch>
@@ -4337,18 +4381,18 @@
           <wp:inline>
             <wp:extent cx="5334000" cy="2328406"/>
             <wp:effectExtent b="0" l="0" r="0" t="0"/>
-            <wp:docPr descr="kubectl resources" title="" id="58" name="Picture"/>
+            <wp:docPr descr="kubectl resources" title="" id="59" name="Picture"/>
             <a:graphic>
               <a:graphicData uri="http://schemas.openxmlformats.org/drawingml/2006/picture">
                 <pic:pic>
                   <pic:nvPicPr>
-                    <pic:cNvPr descr="screenshots/09_k8s_resources.png" id="59" name="Picture"/>
+                    <pic:cNvPr descr="screenshots/09_k8s_resources.png" id="60" name="Picture"/>
                     <pic:cNvPicPr>
                       <a:picLocks noChangeArrowheads="1" noChangeAspect="1"/>
                     </pic:cNvPicPr>
                   </pic:nvPicPr>
                   <pic:blipFill>
-                    <a:blip r:embed="rId57"/>
+                    <a:blip r:embed="rId58"/>
                     <a:stretch>
                       <a:fillRect/>
                     </a:stretch>
@@ -4392,18 +4436,18 @@
           <wp:inline>
             <wp:extent cx="5334000" cy="3112545"/>
             <wp:effectExtent b="0" l="0" r="0" t="0"/>
-            <wp:docPr descr="Prediction through the Kubernetes LoadBalancer" title="" id="61" name="Picture"/>
+            <wp:docPr descr="Prediction through the Kubernetes LoadBalancer" title="" id="62" name="Picture"/>
             <a:graphic>
               <a:graphicData uri="http://schemas.openxmlformats.org/drawingml/2006/picture">
                 <pic:pic>
                   <pic:nvPicPr>
-                    <pic:cNvPr descr="screenshots/10_k8s_predict.png" id="62" name="Picture"/>
+                    <pic:cNvPr descr="screenshots/10_k8s_predict.png" id="63" name="Picture"/>
                     <pic:cNvPicPr>
                       <a:picLocks noChangeArrowheads="1" noChangeAspect="1"/>
                     </pic:cNvPicPr>
                   </pic:nvPicPr>
                   <pic:blipFill>
-                    <a:blip r:embed="rId60"/>
+                    <a:blip r:embed="rId61"/>
                     <a:stretch>
                       <a:fillRect/>
                     </a:stretch>
@@ -4438,8 +4482,8 @@
         <w:t xml:space="preserve">Prediction through the Kubernetes LoadBalancer</w:t>
       </w:r>
     </w:p>
-    <w:bookmarkEnd w:id="63"/>
-    <w:bookmarkStart w:id="70" w:name="monitoring-and-logging"/>
+    <w:bookmarkEnd w:id="64"/>
+    <w:bookmarkStart w:id="71" w:name="monitoring-and-logging"/>
     <w:p>
       <w:pPr>
         <w:pStyle w:val="Heading1"/>
@@ -4727,18 +4771,18 @@
           <wp:inline>
             <wp:extent cx="5334000" cy="3333750"/>
             <wp:effectExtent b="0" l="0" r="0" t="0"/>
-            <wp:docPr descr="Grafana dashboard" title="" id="65" name="Picture"/>
+            <wp:docPr descr="Grafana dashboard" title="" id="66" name="Picture"/>
             <a:graphic>
               <a:graphicData uri="http://schemas.openxmlformats.org/drawingml/2006/picture">
                 <pic:pic>
                   <pic:nvPicPr>
-                    <pic:cNvPr descr="screenshots/06_grafana_dashboard.png" id="66" name="Picture"/>
+                    <pic:cNvPr descr="screenshots/06_grafana_dashboard.png" id="67" name="Picture"/>
                     <pic:cNvPicPr>
                       <a:picLocks noChangeArrowheads="1" noChangeAspect="1"/>
                     </pic:cNvPicPr>
                   </pic:nvPicPr>
                   <pic:blipFill>
-                    <a:blip r:embed="rId64"/>
+                    <a:blip r:embed="rId65"/>
                     <a:stretch>
                       <a:fillRect/>
                     </a:stretch>
@@ -4782,18 +4826,18 @@
           <wp:inline>
             <wp:extent cx="4267200" cy="2133600"/>
             <wp:effectExtent b="0" l="0" r="0" t="0"/>
-            <wp:docPr descr="Prometheus targets" title="" id="68" name="Picture"/>
+            <wp:docPr descr="Prometheus targets" title="" id="69" name="Picture"/>
             <a:graphic>
               <a:graphicData uri="http://schemas.openxmlformats.org/drawingml/2006/picture">
                 <pic:pic>
                   <pic:nvPicPr>
-                    <pic:cNvPr descr="screenshots/07_prometheus_targets.png" id="69" name="Picture"/>
+                    <pic:cNvPr descr="screenshots/07_prometheus_targets.png" id="70" name="Picture"/>
                     <pic:cNvPicPr>
                       <a:picLocks noChangeArrowheads="1" noChangeAspect="1"/>
                     </pic:cNvPicPr>
                   </pic:nvPicPr>
                   <pic:blipFill>
-                    <a:blip r:embed="rId67"/>
+                    <a:blip r:embed="rId68"/>
                     <a:stretch>
                       <a:fillRect/>
                     </a:stretch>
@@ -4828,8 +4872,8 @@
         <w:t xml:space="preserve">Prometheus targets</w:t>
       </w:r>
     </w:p>
-    <w:bookmarkEnd w:id="70"/>
-    <w:bookmarkStart w:id="71" w:name="X870ab7715e9583e7fe998ddcabad63ca335879b"/>
+    <w:bookmarkEnd w:id="71"/>
+    <w:bookmarkStart w:id="72" w:name="X870ab7715e9583e7fe998ddcabad63ca335879b"/>
     <w:p>
       <w:pPr>
         <w:pStyle w:val="Heading1"/>
@@ -4987,8 +5031,8 @@
         <w:t xml:space="preserve">with training statistics (e.g. a PSI metric) would add data-drift detection.</w:t>
       </w:r>
     </w:p>
-    <w:bookmarkEnd w:id="71"/>
-    <w:bookmarkStart w:id="72" w:name="deliverables-checklist"/>
+    <w:bookmarkEnd w:id="72"/>
+    <w:bookmarkStart w:id="73" w:name="deliverables-checklist"/>
     <w:p>
       <w:pPr>
         <w:pStyle w:val="Heading1"/>
@@ -5381,7 +5425,63 @@
               <w:rPr>
                 <w:rStyle w:val="VerbatimChar"/>
               </w:rPr>
+              <w:t xml:space="preserve">report/REPORT.pdf</w:t>
+            </w:r>
+            <w:r>
+              <w:t xml:space="preserve">,</w:t>
+            </w:r>
+            <w:r>
+              <w:t xml:space="preserve"> </w:t>
+            </w:r>
+            <w:r>
+              <w:rPr>
+                <w:rStyle w:val="VerbatimChar"/>
+              </w:rPr>
               <w:t xml:space="preserve">report/REPORT.docx</w:t>
+            </w:r>
+          </w:p>
+        </w:tc>
+      </w:tr>
+      <w:tr>
+        <w:tc>
+          <w:tcPr/>
+          <w:p>
+            <w:pPr>
+              <w:pStyle w:val="Compact"/>
+            </w:pPr>
+            <w:r>
+              <w:t xml:space="preserve">Video demonstration</w:t>
+            </w:r>
+          </w:p>
+        </w:tc>
+        <w:tc>
+          <w:tcPr/>
+          <w:p>
+            <w:pPr>
+              <w:pStyle w:val="Compact"/>
+            </w:pPr>
+            <w:hyperlink r:id="rId9">
+              <w:r>
+                <w:rPr>
+                  <w:rStyle w:val="Hyperlink"/>
+                </w:rPr>
+                <w:t xml:space="preserve">Google Drive Video</w:t>
+              </w:r>
+            </w:hyperlink>
+            <w:r>
+              <w:t xml:space="preserve"> </w:t>
+            </w:r>
+            <w:r>
+              <w:t xml:space="preserve">(</w:t>
+            </w:r>
+            <w:r>
+              <w:rPr>
+                <w:rStyle w:val="VerbatimChar"/>
+              </w:rPr>
+              <w:t xml:space="preserve">https://drive.google.com/file/d/1B5Q_ZFFDnhU_ME6vB6uXpXcSQjFW-JAG/view?usp=sharing</w:t>
+            </w:r>
+            <w:r>
+              <w:t xml:space="preserve">)</w:t>
             </w:r>
           </w:p>
         </w:tc>
@@ -5420,7 +5520,7 @@
         </w:tc>
       </w:tr>
     </w:tbl>
-    <w:bookmarkEnd w:id="72"/>
+    <w:bookmarkEnd w:id="73"/>
     <w:sectPr>
       <w:footnotePr>
         <w:numRestart w:val="eachSect"/>

</xml_diff>